<commit_message>
worked on DGEpi_2026 abstract
</commit_message>
<xml_diff>
--- a/abstracts/DGEpi_2026.docx
+++ b/abstracts/DGEpi_2026.docx
@@ -7,7 +7,7 @@
         <w:pStyle w:val="Title"/>
       </w:pPr>
       <w:r>
-        <w:t xml:space="preserve">Abstract ISEE 2026</w:t>
+        <w:t xml:space="preserve">Abstract DGEpi 2026</w:t>
       </w:r>
     </w:p>
     <w:p>
@@ -21,7 +21,7 @@
         <w:rPr>
           <w:vertAlign w:val="superscript"/>
         </w:rPr>
-        <w:t xml:space="preserve">1,✉</w:t>
+        <w:t xml:space="preserve">1</w:t>
       </w:r>
       <w:r>
         <w:t xml:space="preserve">, Margaux Sanchez</w:t>
@@ -107,35 +107,7 @@
         <w:t xml:space="preserve">Karolinska Institutet, Department of Medicine Solna, Division of Clinical Epidemiology, Stockholm, Sweden</w:t>
       </w:r>
     </w:p>
-    <w:p>
-      <w:pPr>
-        <w:pStyle w:val="BodyText"/>
-      </w:pPr>
-      <w:r>
-        <w:rPr>
-          <w:vertAlign w:val="superscript"/>
-        </w:rPr>
-        <w:t xml:space="preserve">✉</w:t>
-      </w:r>
-      <w:r>
-        <w:t xml:space="preserve"> </w:t>
-      </w:r>
-      <w:r>
-        <w:t xml:space="preserve">Correspondence:</w:t>
-      </w:r>
-      <w:r>
-        <w:t xml:space="preserve"> </w:t>
-      </w:r>
-      <w:hyperlink r:id="rId20">
-        <w:r>
-          <w:rPr>
-            <w:rStyle w:val="Hyperlink"/>
-          </w:rPr>
-          <w:t xml:space="preserve">Paulina Sell &lt;paulina.sell@uba.de&gt;</w:t>
-        </w:r>
-      </w:hyperlink>
-    </w:p>
-    <w:bookmarkStart w:id="22" w:name="information-for-authors"/>
+    <w:bookmarkStart w:id="21" w:name="information-for-authors"/>
     <w:p>
       <w:pPr>
         <w:pStyle w:val="Heading2"/>
@@ -252,7 +224,7 @@
       <w:r>
         <w:t xml:space="preserve"> </w:t>
       </w:r>
-      <w:hyperlink r:id="rId21">
+      <w:hyperlink r:id="rId20">
         <w:r>
           <w:rPr>
             <w:rStyle w:val="Hyperlink"/>
@@ -405,14 +377,96 @@
         <w:t xml:space="preserve">To present your paper, you must register for the congress for the fee and pay the registration fee in due time.</w:t>
       </w:r>
     </w:p>
+    <w:bookmarkEnd w:id="21"/>
+    <w:bookmarkStart w:id="22" w:name="keywords"/>
+    <w:p>
+      <w:pPr>
+        <w:pStyle w:val="Heading2"/>
+      </w:pPr>
+      <w:r>
+        <w:t xml:space="preserve">Keywords</w:t>
+      </w:r>
+    </w:p>
+    <w:p>
+      <w:pPr>
+        <w:pStyle w:val="FirstParagraph"/>
+      </w:pPr>
+      <w:r>
+        <w:t xml:space="preserve">Meta-analysis</w:t>
+      </w:r>
+      <w:r>
+        <w:br/>
+      </w:r>
+      <w:r>
+        <w:t xml:space="preserve">Evidence synthesis</w:t>
+      </w:r>
+      <w:r>
+        <w:br/>
+      </w:r>
+      <w:r>
+        <w:t xml:space="preserve">Bayesian modeling</w:t>
+      </w:r>
+      <w:r>
+        <w:br/>
+      </w:r>
+      <w:r>
+        <w:t xml:space="preserve">Uncertainty quantification</w:t>
+      </w:r>
+      <w:r>
+        <w:br/>
+      </w:r>
+      <w:r>
+        <w:t xml:space="preserve">Lead exposure</w:t>
+      </w:r>
+      <w:r>
+        <w:br/>
+      </w:r>
+    </w:p>
+    <w:p>
+      <w:pPr>
+        <w:pStyle w:val="BodyText"/>
+      </w:pPr>
+      <w:r>
+        <w:rPr>
+          <w:b/>
+          <w:bCs/>
+        </w:rPr>
+        <w:t xml:space="preserve">Topic</w:t>
+      </w:r>
+      <w:r>
+        <w:t xml:space="preserve">: Environmental Epidemiology</w:t>
+      </w:r>
+      <w:r>
+        <w:br/>
+      </w:r>
+      <w:r>
+        <w:rPr>
+          <w:b/>
+          <w:bCs/>
+        </w:rPr>
+        <w:t xml:space="preserve">Method</w:t>
+      </w:r>
+      <w:r>
+        <w:t xml:space="preserve">: Evidence Synthesis and Triangulation</w:t>
+      </w:r>
+    </w:p>
     <w:bookmarkEnd w:id="22"/>
-    <w:bookmarkStart w:id="23" w:name="keywords"/>
+    <w:bookmarkStart w:id="24" w:name="abstract"/>
     <w:p>
       <w:pPr>
         <w:pStyle w:val="Heading2"/>
       </w:pPr>
       <w:r>
-        <w:t xml:space="preserve">Keywords</w:t>
+        <w:t xml:space="preserve">Abstract</w:t>
+      </w:r>
+    </w:p>
+    <w:bookmarkStart w:id="23" w:name="Xe1419aa8ec0d4918e6d611078ec644dda570126"/>
+    <w:p>
+      <w:pPr>
+        <w:pStyle w:val="Heading3"/>
+      </w:pPr>
+      <w:r>
+        <w:t xml:space="preserve">Quantifying uncertainty: A methodological comparison of Bayesian and frequentist meta-analyses of studies on lead exposure and children’s intelligence quotient</w:t>
       </w:r>
     </w:p>
     <w:p>
@@ -420,71 +474,14 @@
         <w:pStyle w:val="FirstParagraph"/>
       </w:pPr>
       <w:r>
-        <w:t xml:space="preserve">Meta-analysis</w:t>
-      </w:r>
-      <w:r>
-        <w:br/>
-      </w:r>
-      <w:r>
-        <w:t xml:space="preserve">Evidence synthesis</w:t>
-      </w:r>
-      <w:r>
-        <w:br/>
-      </w:r>
-      <w:r>
-        <w:t xml:space="preserve">Bayesian modeling</w:t>
-      </w:r>
-      <w:r>
-        <w:br/>
-      </w:r>
-      <w:r>
-        <w:t xml:space="preserve">Uncertainty quantification</w:t>
-      </w:r>
-      <w:r>
-        <w:br/>
-      </w:r>
-      <w:r>
-        <w:t xml:space="preserve">Lead exposure</w:t>
-      </w:r>
-      <w:r>
-        <w:br/>
-      </w:r>
-    </w:p>
-    <w:bookmarkEnd w:id="23"/>
-    <w:bookmarkStart w:id="29" w:name="abstract"/>
-    <w:p>
-      <w:pPr>
-        <w:pStyle w:val="Heading2"/>
-      </w:pPr>
-      <w:r>
-        <w:t xml:space="preserve">Abstract</w:t>
-      </w:r>
-    </w:p>
-    <w:bookmarkStart w:id="24" w:name="Xe1419aa8ec0d4918e6d611078ec644dda570126"/>
-    <w:p>
-      <w:pPr>
-        <w:pStyle w:val="Heading3"/>
-      </w:pPr>
-      <w:r>
-        <w:t xml:space="preserve">Quantifying uncertainty: A methodological comparison of Bayesian and frequentist meta-analyses of studies on lead exposure and children’s intelligence quotient</w:t>
-      </w:r>
-    </w:p>
-    <w:bookmarkEnd w:id="24"/>
-    <w:bookmarkStart w:id="25" w:name="objective"/>
-    <w:p>
-      <w:pPr>
-        <w:pStyle w:val="Heading3"/>
-      </w:pPr>
-      <w:r>
-        <w:t xml:space="preserve">Objective</w:t>
-      </w:r>
-    </w:p>
-    <w:p>
-      <w:pPr>
-        <w:pStyle w:val="FirstParagraph"/>
-      </w:pPr>
-      <w:r>
-        <w:t xml:space="preserve">Quantifying uncertainty is crucial for risk assessment and policy-making but current meta-analytic approaches fall short in this regard.</w:t>
+        <w:rPr>
+          <w:b/>
+          <w:bCs/>
+        </w:rPr>
+        <w:t xml:space="preserve">Introduction</w:t>
+      </w:r>
+      <w:r>
+        <w:t xml:space="preserve">: Quantifying uncertainty in the context of evidence synthesis is crucial for risk assessment and policy-making, but current meta-analytic frameworks fall short in this regard.</w:t>
       </w:r>
       <w:r>
         <w:t xml:space="preserve"> </w:t>
@@ -496,31 +493,116 @@
         <w:t xml:space="preserve"> </w:t>
       </w:r>
       <w:r>
-        <w:t xml:space="preserve">To evaluate differences in uncertainty quantification and applicability for risk assessment, we compared frequentist and Bayesian frameworks, using lead exposure and children’s intelligence quotient (IQ) as a case study.</w:t>
-      </w:r>
-    </w:p>
-    <w:bookmarkEnd w:id="25"/>
-    <w:bookmarkStart w:id="26" w:name="material-and-methods"/>
-    <w:p>
-      <w:pPr>
-        <w:pStyle w:val="Heading3"/>
-      </w:pPr>
-      <w:r>
-        <w:t xml:space="preserve">Material and Methods</w:t>
-      </w:r>
-    </w:p>
-    <w:p>
-      <w:pPr>
-        <w:pStyle w:val="FirstParagraph"/>
-      </w:pPr>
-      <w:r>
-        <w:t xml:space="preserve">We systematically searched PubMed and Scopus for epidemiological studies on blood lead level (BLL) and IQ score in children.</w:t>
-      </w:r>
-      <w:r>
-        <w:t xml:space="preserve"> </w:t>
-      </w:r>
-      <w:r>
-        <w:t xml:space="preserve">Risk of bias (RoB) was assessed and regression coefficients were harmonized to the</w:t>
+        <w:t xml:space="preserve">We compared frequentist and Bayesian meta-analytic frameworks, using lead exposure and IQ as a case study.</w:t>
+      </w:r>
+    </w:p>
+    <w:p>
+      <w:pPr>
+        <w:pStyle w:val="BodyText"/>
+      </w:pPr>
+      <w:r>
+        <w:rPr>
+          <w:b/>
+          <w:bCs/>
+        </w:rPr>
+        <w:t xml:space="preserve">Methods</w:t>
+      </w:r>
+      <w:r>
+        <w:t xml:space="preserve">: We systematically searched PubMed and Scopus for epidemiological studies on blood lead level (BLL) and IQ score in children.</w:t>
+      </w:r>
+      <w:r>
+        <w:t xml:space="preserve"> </w:t>
+      </w:r>
+      <w:r>
+        <w:t xml:space="preserve">Risk of bias (RoB) was assessed and regression coefficients were harmonized.</w:t>
+      </w:r>
+      <w:r>
+        <w:t xml:space="preserve"> </w:t>
+      </w:r>
+      <w:r>
+        <w:t xml:space="preserve">In both meta-analyses, we used random-effects models and included the same effect estimates.</w:t>
+      </w:r>
+      <w:r>
+        <w:t xml:space="preserve"> </w:t>
+      </w:r>
+      <w:r>
+        <w:t xml:space="preserve"> </w:t>
+      </w:r>
+      <w:r>
+        <w:t xml:space="preserve">The Bayesian meta-analysis employed a hierarchical model with weakly-informative priors.</w:t>
+      </w:r>
+      <w:r>
+        <w:t xml:space="preserve"> </w:t>
+      </w:r>
+      <w:r>
+        <w:t xml:space="preserve">Sensitivity analyses examined robustness to RoB and prior specification.</w:t>
+      </w:r>
+      <w:r>
+        <w:t xml:space="preserve"> </w:t>
+      </w:r>
+      <m:oMath>
+        <m:sSup>
+          <m:e>
+            <m:r>
+              <m:t>τ</m:t>
+            </m:r>
+          </m:e>
+          <m:sup>
+            <m:r>
+              <m:t>2</m:t>
+            </m:r>
+          </m:sup>
+        </m:sSup>
+      </m:oMath>
+      <w:r>
+        <w:t xml:space="preserve"> </w:t>
+      </w:r>
+      <w:r>
+        <w:t xml:space="preserve">and</w:t>
+      </w:r>
+      <w:r>
+        <w:t xml:space="preserve"> </w:t>
+      </w:r>
+      <m:oMath>
+        <m:sSup>
+          <m:e>
+            <m:r>
+              <m:t>I</m:t>
+            </m:r>
+          </m:e>
+          <m:sup>
+            <m:r>
+              <m:t>2</m:t>
+            </m:r>
+          </m:sup>
+        </m:sSup>
+      </m:oMath>
+      <w:r>
+        <w:t xml:space="preserve"> </w:t>
+      </w:r>
+      <w:r>
+        <w:t xml:space="preserve">were estimated as measures of between-study heterogeneity.</w:t>
+      </w:r>
+    </w:p>
+    <w:p>
+      <w:pPr>
+        <w:pStyle w:val="BodyText"/>
+      </w:pPr>
+      <w:r>
+        <w:rPr>
+          <w:b/>
+          <w:bCs/>
+        </w:rPr>
+        <w:t xml:space="preserve">Results</w:t>
+      </w:r>
+      <w:r>
+        <w:t xml:space="preserve">: Twelve studies were included after screening.</w:t>
+      </w:r>
+      <w:r>
+        <w:t xml:space="preserve"> </w:t>
+      </w:r>
+      <w:r>
+        <w:t xml:space="preserve">The frequentist approach yielded a pooled estimate of -2.45 (95% confidence interval: -3.7; -1.2) IQ points per unit increase in</w:t>
       </w:r>
       <w:r>
         <w:t xml:space="preserve"> </w:t>
@@ -543,130 +625,13 @@
         </m:sSub>
       </m:oMath>
       <w:r>
-        <w:t xml:space="preserve">​ scale.</w:t>
-      </w:r>
-      <w:r>
-        <w:t xml:space="preserve"> </w:t>
-      </w:r>
-      <w:r>
-        <w:t xml:space="preserve">In both meta-analyses, we assumed a multilevel structure, used random-effects models and included the same effect estimates.</w:t>
-      </w:r>
-      <w:r>
-        <w:t xml:space="preserve"> </w:t>
-      </w:r>
-      <w:r>
-        <w:t xml:space="preserve">The frequentist approach used restricted maximum-likelihood estimation.</w:t>
-      </w:r>
-      <w:r>
-        <w:t xml:space="preserve"> </w:t>
-      </w:r>
-      <w:r>
-        <w:t xml:space="preserve">The Bayesian meta-analysis employed a hierarchical model with weakly-informative priors.</w:t>
-      </w:r>
-      <w:r>
-        <w:t xml:space="preserve"> </w:t>
-      </w:r>
-      <w:r>
-        <w:t xml:space="preserve">Sensitivity analyses examined robustness to RoB and prior specification.</w:t>
-      </w:r>
-      <w:r>
-        <w:t xml:space="preserve"> </w:t>
-      </w:r>
-      <m:oMath>
-        <m:sSup>
-          <m:e>
-            <m:r>
-              <m:t>τ</m:t>
-            </m:r>
-          </m:e>
-          <m:sup>
-            <m:r>
-              <m:t>2</m:t>
-            </m:r>
-          </m:sup>
-        </m:sSup>
-      </m:oMath>
-      <w:r>
-        <w:t xml:space="preserve"> </w:t>
-      </w:r>
-      <w:r>
-        <w:t xml:space="preserve">and</w:t>
-      </w:r>
-      <w:r>
-        <w:t xml:space="preserve"> </w:t>
-      </w:r>
-      <m:oMath>
-        <m:sSup>
-          <m:e>
-            <m:r>
-              <m:t>I</m:t>
-            </m:r>
-          </m:e>
-          <m:sup>
-            <m:r>
-              <m:t>2</m:t>
-            </m:r>
-          </m:sup>
-        </m:sSup>
-      </m:oMath>
-      <w:r>
-        <w:t xml:space="preserve"> </w:t>
-      </w:r>
-      <w:r>
-        <w:t xml:space="preserve">were estimated as measures of between-study heterogeneity.</w:t>
-      </w:r>
-    </w:p>
-    <w:bookmarkEnd w:id="26"/>
-    <w:bookmarkStart w:id="27" w:name="results"/>
-    <w:p>
-      <w:pPr>
-        <w:pStyle w:val="Heading3"/>
-      </w:pPr>
-      <w:r>
-        <w:t xml:space="preserve">Results</w:t>
-      </w:r>
-    </w:p>
-    <w:p>
-      <w:pPr>
-        <w:pStyle w:val="FirstParagraph"/>
-      </w:pPr>
-      <w:r>
-        <w:t xml:space="preserve">Twelve studies were included after screening.</w:t>
-      </w:r>
-      <w:r>
-        <w:t xml:space="preserve"> </w:t>
-      </w:r>
-      <w:r>
-        <w:t xml:space="preserve">The frequentist approach yielded a pooled estimate of -2.45 (95% confidence interval (CI): -3.7; -1.2) IQ points per unit increase in</w:t>
-      </w:r>
-      <w:r>
-        <w:t xml:space="preserve"> </w:t>
-      </w:r>
-      <m:oMath>
-        <m:sSub>
-          <m:e>
-            <m:r>
-              <m:rPr>
-                <m:sty m:val="p"/>
-              </m:rPr>
-              <m:t>log</m:t>
-            </m:r>
-          </m:e>
-          <m:sub>
-            <m:r>
-              <m:t>e</m:t>
-            </m:r>
-          </m:sub>
-        </m:sSub>
-      </m:oMath>
-      <w:r>
         <w:t xml:space="preserve">-transformed BLL (µg/dL).</w:t>
       </w:r>
       <w:r>
         <w:t xml:space="preserve"> </w:t>
       </w:r>
       <w:r>
-        <w:t xml:space="preserve">The Bayesian model yielded a mean pooled estimate of -2.28 (95% credible interval (CrI): -3.56; -1.06).</w:t>
+        <w:t xml:space="preserve">The Bayesian model yielded a mean pooled estimate of -2.28 (95% credible interval: -3.56; -1.06).</w:t>
       </w:r>
       <w:r>
         <w:t xml:space="preserve"> </w:t>
@@ -778,7 +743,7 @@
         <w:t xml:space="preserve"> </w:t>
       </w:r>
       <w:r>
-        <w:t xml:space="preserve">The Bayesian approach provided a posterior distribution for heterogeneity, quantifying uncertainty from between-study variation.</w:t>
+        <w:t xml:space="preserve">The Bayesian framework provided a posterior distribution for heterogeneity, quantifying uncertainty from between-study variation.</w:t>
       </w:r>
       <w:r>
         <w:t xml:space="preserve"> </w:t>
@@ -790,31 +755,28 @@
         <w:t xml:space="preserve"> </w:t>
       </w:r>
       <w:r>
-        <w:t xml:space="preserve">The Bayesian approach was less sensitive to outlier studies, resulting in a lower pooled effect.</w:t>
-      </w:r>
-    </w:p>
-    <w:bookmarkEnd w:id="27"/>
-    <w:bookmarkStart w:id="28" w:name="conclusion"/>
-    <w:p>
-      <w:pPr>
-        <w:pStyle w:val="Heading3"/>
-      </w:pPr>
-      <w:r>
+        <w:t xml:space="preserve">The Bayesian framework was less sensitive to outlier studies, resulting in a lower pooled effect.</w:t>
+      </w:r>
+    </w:p>
+    <w:p>
+      <w:pPr>
+        <w:pStyle w:val="BodyText"/>
+      </w:pPr>
+      <w:r>
+        <w:rPr>
+          <w:b/>
+          <w:bCs/>
+        </w:rPr>
         <w:t xml:space="preserve">Conclusion</w:t>
       </w:r>
-    </w:p>
-    <w:p>
-      <w:pPr>
-        <w:pStyle w:val="FirstParagraph"/>
-      </w:pPr>
-      <w:r>
-        <w:t xml:space="preserve">We provide updated pooled estimates for the effect of lead exposure on children’s IQ.</w:t>
-      </w:r>
-      <w:r>
-        <w:t xml:space="preserve"> </w:t>
-      </w:r>
-      <w:r>
-        <w:t xml:space="preserve">The Bayesian approach provides posterior distributions, enabling direct probability statements, for example about exceeding risk thresholds, and comparative assessments across pollutants.</w:t>
+      <w:r>
+        <w:t xml:space="preserve">: We provide updated pooled estimates for the effect of lead exposure on children’s IQ.</w:t>
+      </w:r>
+      <w:r>
+        <w:t xml:space="preserve"> </w:t>
+      </w:r>
+      <w:r>
+        <w:t xml:space="preserve">The Bayesian framework provides posterior distributions, enabling direct probability statements, for example about exceeding risk thresholds, and comparative assessments across pollutants.</w:t>
       </w:r>
       <w:r>
         <w:t xml:space="preserve"> </w:t>
@@ -823,16 +785,8 @@
         <w:t xml:space="preserve">These features are of particular value regarding risk assessment and policy-making.</w:t>
       </w:r>
     </w:p>
-    <w:p>
-      <w:pPr>
-        <w:pStyle w:val="BodyText"/>
-      </w:pPr>
-      <w:r>
-        <w:t xml:space="preserve">Funded under EU Horizon (Grant Agreement No 101057014).</w:t>
-      </w:r>
-    </w:p>
-    <w:bookmarkEnd w:id="28"/>
-    <w:bookmarkEnd w:id="29"/>
+    <w:bookmarkEnd w:id="23"/>
+    <w:bookmarkEnd w:id="24"/>
     <w:sectPr>
       <w:footnotePr>
         <w:numRestart w:val="eachSect"/>

</xml_diff>

<commit_message>
removed absolute file paths
</commit_message>
<xml_diff>
--- a/abstracts/DGEpi_2026.docx
+++ b/abstracts/DGEpi_2026.docx
@@ -114,6 +114,28 @@
       </w:pPr>
       <w:r>
         <w:t xml:space="preserve">Information for Authors</w:t>
+      </w:r>
+    </w:p>
+    <w:p>
+      <w:pPr>
+        <w:pStyle w:val="Compact"/>
+        <w:numPr>
+          <w:ilvl w:val="0"/>
+          <w:numId w:val="1001"/>
+        </w:numPr>
+      </w:pPr>
+      <w:r>
+        <w:t xml:space="preserve">Abstract submission deadline:</w:t>
+      </w:r>
+      <w:r>
+        <w:t xml:space="preserve"> </w:t>
+      </w:r>
+      <w:r>
+        <w:rPr>
+          <w:b/>
+          <w:bCs/>
+        </w:rPr>
+        <w:t xml:space="preserve">April 15, 2026</w:t>
       </w:r>
     </w:p>
     <w:p>
@@ -481,13 +503,13 @@
         <w:t xml:space="preserve">Introduction</w:t>
       </w:r>
       <w:r>
-        <w:t xml:space="preserve">: Quantifying uncertainty in the context of evidence synthesis is crucial for risk assessment and policy-making, but current meta-analytic frameworks fall short in this regard.</w:t>
-      </w:r>
-      <w:r>
-        <w:t xml:space="preserve"> </w:t>
-      </w:r>
-      <w:r>
-        <w:t xml:space="preserve">Bayesian meta-analysis provides probabilistic uncertainty quantification.</w:t>
+        <w:t xml:space="preserve">: Uncertainty quantification in evidence synthesis is crucial for risk assessment and policy-making, but current meta-analysis approaches often fall short in this regard.</w:t>
+      </w:r>
+      <w:r>
+        <w:t xml:space="preserve"> </w:t>
+      </w:r>
+      <w:r>
+        <w:t xml:space="preserve">The Bayesian framework provides probabilistic uncertainty quantification.</w:t>
       </w:r>
       <w:r>
         <w:t xml:space="preserve"> </w:t>
@@ -783,6 +805,39 @@
       </w:r>
       <w:r>
         <w:t xml:space="preserve">These features are of particular value regarding risk assessment and policy-making.</w:t>
+      </w:r>
+    </w:p>
+    <w:tbl>
+      <w:tblPr>
+        <w:tblStyle w:val="FigureTable"/>
+        <w:tblW w:type="auto" w:w="0"/>
+        <w:jc w:val="center"/>
+        <w:tblLook w:firstRow="0" w:lastRow="0" w:firstColumn="0" w:lastColumn="0"/>
+      </w:tblPr>
+      <w:tblGrid>
+        <w:gridCol w:w="7920"/>
+      </w:tblGrid>
+      <w:tr>
+        <w:tc>
+          <w:tcPr/>
+          <w:p>
+            <w:pPr>
+              <w:pStyle w:val="Compact"/>
+              <w:jc w:val="center"/>
+            </w:pPr>
+            <w:r>
+              <w:t xml:space="preserve">Fig. 1: Forest plots for Bayesian (left) and frequentist (right) meta-analyses. BLL, blood lead level; CI, confidence interval; CrI, credible interval</w:t>
+            </w:r>
+          </w:p>
+        </w:tc>
+      </w:tr>
+    </w:tbl>
+    <w:p>
+      <w:pPr>
+        <w:pStyle w:val="ImageCaption"/>
+      </w:pPr>
+      <w:r>
+        <w:t xml:space="preserve">Fig. 1: Forest plots for Bayesian (left) and frequentist (right) meta-analyses. BLL, blood lead level; CI, confidence interval; CrI, credible interval</w:t>
       </w:r>
     </w:p>
     <w:bookmarkEnd w:id="23"/>

</xml_diff>